<commit_message>
Updated all files in the portfolio
</commit_message>
<xml_diff>
--- a/portfolio/public/Olokode_Elijah_Resume1.docx
+++ b/portfolio/public/Olokode_Elijah_Resume1.docx
@@ -101,7 +101,7 @@
         <w:spacing w:before="100" w:after="80"/>
       </w:pPr>
       <w:r>
-        <w:t>Results-driven Front-End Developer with 3 years of hands-on experience designing and building responsive, high-performance web applications. Proficient in React.js, Next.js, and modern JavaScript (ES6+), with a strong eye for detail and a passion for delivering seamless user experiences. Demonstrated ability to translate complex requirements into clean, maintainable code, integrate third-party APIs, and implement secure authentication systems. Committed to mobile-first development, accessibility, and continuously adopting best practices to deliver scalable front-end solutions.</w:t>
+        <w:t>Results-oriented Front-End Developer with three years of hands-on experience in designing and building responsive, high-performance web applications. Highly skilled in React.js, Next.js, and modern JavaScript (ES6+), complemented by a keen attention to detail and a strong commitment to delivering seamless user experiences. Proven ability to translate complex requirements into clean, maintainable code, integrate third-party APIs, and implement secure authentication systems. Dedicated to mobile-first development, accessibility, and continuously adopting best practices to provide scalable front-end solutions.</w:t>
       </w:r>
     </w:p>
     <w:p>
@@ -145,12 +145,6 @@
         <w:gridCol w:w="7480"/>
       </w:tblGrid>
       <w:tr>
-        <w:tblPrEx>
-          <w:tblCellMar>
-            <w:top w:w="0" w:type="dxa"/>
-            <w:bottom w:w="0" w:type="dxa"/>
-          </w:tblCellMar>
-        </w:tblPrEx>
         <w:tc>
           <w:tcPr>
             <w:tcW w:w="2600" w:type="dxa"/>
@@ -208,12 +202,6 @@
         </w:tc>
       </w:tr>
       <w:tr>
-        <w:tblPrEx>
-          <w:tblCellMar>
-            <w:top w:w="0" w:type="dxa"/>
-            <w:bottom w:w="0" w:type="dxa"/>
-          </w:tblCellMar>
-        </w:tblPrEx>
         <w:tc>
           <w:tcPr>
             <w:tcW w:w="2600" w:type="dxa"/>
@@ -271,12 +259,6 @@
         </w:tc>
       </w:tr>
       <w:tr>
-        <w:tblPrEx>
-          <w:tblCellMar>
-            <w:top w:w="0" w:type="dxa"/>
-            <w:bottom w:w="0" w:type="dxa"/>
-          </w:tblCellMar>
-        </w:tblPrEx>
         <w:tc>
           <w:tcPr>
             <w:tcW w:w="2600" w:type="dxa"/>
@@ -334,12 +316,6 @@
         </w:tc>
       </w:tr>
       <w:tr>
-        <w:tblPrEx>
-          <w:tblCellMar>
-            <w:top w:w="0" w:type="dxa"/>
-            <w:bottom w:w="0" w:type="dxa"/>
-          </w:tblCellMar>
-        </w:tblPrEx>
         <w:tc>
           <w:tcPr>
             <w:tcW w:w="2600" w:type="dxa"/>
@@ -413,12 +389,6 @@
         </w:tc>
       </w:tr>
       <w:tr>
-        <w:tblPrEx>
-          <w:tblCellMar>
-            <w:top w:w="0" w:type="dxa"/>
-            <w:bottom w:w="0" w:type="dxa"/>
-          </w:tblCellMar>
-        </w:tblPrEx>
         <w:tc>
           <w:tcPr>
             <w:tcW w:w="2600" w:type="dxa"/>
@@ -476,12 +446,6 @@
         </w:tc>
       </w:tr>
       <w:tr>
-        <w:tblPrEx>
-          <w:tblCellMar>
-            <w:top w:w="0" w:type="dxa"/>
-            <w:bottom w:w="0" w:type="dxa"/>
-          </w:tblCellMar>
-        </w:tblPrEx>
         <w:tc>
           <w:tcPr>
             <w:tcW w:w="2600" w:type="dxa"/>

</xml_diff>